<commit_message>
docs(marketing): add the multi-channel GTM assets and refresh the existing ones
Shopee listing, Threads posts, the day 7-28 growth playbook, a video-free
variant of the 14-day organic plan, and the 1-7 day ads plan; plus edits to the
hooks, 14-day and landing-audit docs.

Co-Authored-By: Claude Opus 5 <noreply@anthropic.com>
</commit_message>
<xml_diff>
--- a/fincards-organic-content-plan-14hari.docx
+++ b/fincards-organic-content-plan-14hari.docx
@@ -4822,6 +4822,24 @@
     </w:p>
     <w:p>
       <w:pPr>
+        <w:shd w:fill="F7EBD7" w:color="auto" w:val="clear"/>
+        <w:spacing w:after="140"/>
+        <w:ind w:left="60" w:right="60"/>
+      </w:pPr>
+      <w:r>
+        <w:rPr>
+          <w:rFonts w:ascii="Calibri" w:cs="Calibri" w:eastAsia="Calibri" w:hAnsi="Calibri"/>
+          <w:i/>
+          <w:iCs/>
+          <w:color w:val="5C4A3A"/>
+          <w:sz w:val="20"/>
+          <w:szCs w:val="20"/>
+        </w:rPr>
+        <w:t xml:space="preserve">BOOMERANG GUARD (wajib): JANGAN pakai red flag soal “tanggal/lokasi harus di layar pertama” atau “animasi kebanyakan” — itu bumerang: Solary sengaja buka sinematik, tanggal &amp; lokasi baru muncul di detailsPlanet setelah scroll ~5-6 planet. (RF 02 lama “Tanggal &amp; lokasi ketimbun animasi” diganti persis karena ini.) Dua red flag lain sudah diverifikasi aman di kode: FinCards punya link personal per tamu (Guests tab → token per tamu), dan musik TIDAK autoplay — ada MusicPopup yang minta izin dulu + MuteButton. Watermark juga aman: FinCards nol watermark di semua tier.</w:t>
+      </w:r>
+    </w:p>
+    <w:p>
+      <w:pPr>
         <w:spacing w:after="60" w:before="0"/>
       </w:pPr>
       <w:r>
@@ -4908,7 +4926,7 @@
           <w:rFonts w:ascii="Calibri" w:cs="Calibri" w:eastAsia="Calibri" w:hAnsi="Calibri"/>
           <w:color w:val="2A2118"/>
         </w:rPr>
-        <w:t xml:space="preserve">6 slide — Slide 2: loading lambat &amp; berat pas dibuka di HP. Slide 3: template itu-itu aja, semua orang udah pernah lihat. Slide 4: cuma nama-tanggal-lokasi, ga ada “rasa” atau cerita. Slide 5: “Gimana caranya bikin undangan yang gampang diakses TAPI berkesan?” Slide 6 (CTA): “FinCards dirancang buat ngindarin 3 hal ini dari awal. Link di bio.”</w:t>
+        <w:t xml:space="preserve">6 slide, 3 red flags terverifikasi aman — Slide 2 (RF 01): Sapaan “Bapak/Ibu/Saudara/i” tanpa nama; satu link disebar ke semua, tamu ngerasa cuma nomor di daftar broadcast. Slide 3 (RF 02): Watermark platform nempel; logo layanan gratisan mejeng di undangan, kesannya numpang template murahan. Slide 4 (RF 03): Musik autoplay kenceng tanpa izin; dibuka di kantor atau angkot tiba-tiba bunyi, tamu panik nutup. Slide 5 (refleksi): “Lima detik pertama tamu buka undanganmu — kesan apa yang mereka dapat?” Slide 6 (CTA): “FinCards dirancang buat ngindarin 3 hal ini.” + Link di bio + tagline designed to be remembered.</w:t>
       </w:r>
     </w:p>
     <w:p>
@@ -5033,63 +5051,245 @@
                 <w:sz w:val="18"/>
                 <w:szCs w:val="18"/>
               </w:rPr>
-              <w:t xml:space="preserve">- Slide 2-4: satu poin per slide, ikon garis simpel di atas (terracotta #E8553E),</w:t>
-            </w:r>
-          </w:p>
-          <w:p>
-            <w:pPr>
-              <w:spacing w:after="40"/>
-            </w:pPr>
-            <w:r>
-              <w:rPr>
-                <w:rFonts w:ascii="Consolas" w:cs="Consolas" w:eastAsia="Consolas" w:hAnsi="Consolas"/>
-                <w:color w:val="2A2118"/>
-                <w:sz w:val="18"/>
-                <w:szCs w:val="18"/>
-              </w:rPr>
-              <w:t xml:space="preserve">  judul poin Montserrat, penjelasan 1 kalimat Biryani #5C4A3A. Nomor besar tipis di pojok.</w:t>
-            </w:r>
-          </w:p>
-          <w:p>
-            <w:pPr>
-              <w:spacing w:after="40"/>
-            </w:pPr>
-            <w:r>
-              <w:rPr>
-                <w:rFonts w:ascii="Consolas" w:cs="Consolas" w:eastAsia="Consolas" w:hAnsi="Consolas"/>
-                <w:color w:val="2A2118"/>
-                <w:sz w:val="18"/>
-                <w:szCs w:val="18"/>
-              </w:rPr>
-              <w:t xml:space="preserve">- Slide 5: pertanyaan reflektif, teks tengah, background gradient cream ke #F7EBD7.</w:t>
-            </w:r>
-          </w:p>
-          <w:p>
-            <w:pPr>
-              <w:spacing w:after="40"/>
-            </w:pPr>
-            <w:r>
-              <w:rPr>
-                <w:rFonts w:ascii="Consolas" w:cs="Consolas" w:eastAsia="Consolas" w:hAnsi="Consolas"/>
-                <w:color w:val="2A2118"/>
-                <w:sz w:val="18"/>
-                <w:szCs w:val="18"/>
-              </w:rPr>
-              <w:t xml:space="preserve">- Slide 6 (CTA): "FinCards dirancang buat ngindarin 3 hal ini." + wordmark FinCards +</w:t>
-            </w:r>
-          </w:p>
-          <w:p>
-            <w:pPr>
-              <w:spacing w:after="40"/>
-            </w:pPr>
-            <w:r>
-              <w:rPr>
-                <w:rFonts w:ascii="Consolas" w:cs="Consolas" w:eastAsia="Consolas" w:hAnsi="Consolas"/>
-                <w:color w:val="2A2118"/>
-                <w:sz w:val="18"/>
-                <w:szCs w:val="18"/>
-              </w:rPr>
-              <w:t xml:space="preserve">  "Link di bio" dalam pill terracotta #E8553E teks cream.</w:t>
+              <w:t xml:space="preserve">- Slide 2 (RF 01): ikon orang (garis, terracotta). Judul "Sapaan 'Bapak/Ibu/Saudara/i'</w:t>
+            </w:r>
+          </w:p>
+          <w:p>
+            <w:pPr>
+              <w:spacing w:after="40"/>
+            </w:pPr>
+            <w:r>
+              <w:rPr>
+                <w:rFonts w:ascii="Consolas" w:cs="Consolas" w:eastAsia="Consolas" w:hAnsi="Consolas"/>
+                <w:color w:val="2A2118"/>
+                <w:sz w:val="18"/>
+                <w:szCs w:val="18"/>
+              </w:rPr>
+              <w:t xml:space="preserve">  tanpa nama" — body "Satu link disebar ke semua — tamu langsung ngerasa cuma nomor di</w:t>
+            </w:r>
+          </w:p>
+          <w:p>
+            <w:pPr>
+              <w:spacing w:after="40"/>
+            </w:pPr>
+            <w:r>
+              <w:rPr>
+                <w:rFonts w:ascii="Consolas" w:cs="Consolas" w:eastAsia="Consolas" w:hAnsi="Consolas"/>
+                <w:color w:val="2A2118"/>
+                <w:sz w:val="18"/>
+                <w:szCs w:val="18"/>
+              </w:rPr>
+              <w:t xml:space="preserve">  daftar broadcast, bukan orang yang beneran diundang."</w:t>
+            </w:r>
+          </w:p>
+          <w:p>
+            <w:pPr>
+              <w:spacing w:after="40"/>
+            </w:pPr>
+            <w:r>
+              <w:rPr>
+                <w:rFonts w:ascii="Consolas" w:cs="Consolas" w:eastAsia="Consolas" w:hAnsi="Consolas"/>
+                <w:color w:val="2A2118"/>
+                <w:sz w:val="18"/>
+                <w:szCs w:val="18"/>
+              </w:rPr>
+              <w:t xml:space="preserve">- Slide 3 (RF 02): ikon stempel/watermark (garis, terracotta). Judul "Watermark platform</w:t>
+            </w:r>
+          </w:p>
+          <w:p>
+            <w:pPr>
+              <w:spacing w:after="40"/>
+            </w:pPr>
+            <w:r>
+              <w:rPr>
+                <w:rFonts w:ascii="Consolas" w:cs="Consolas" w:eastAsia="Consolas" w:hAnsi="Consolas"/>
+                <w:color w:val="2A2118"/>
+                <w:sz w:val="18"/>
+                <w:szCs w:val="18"/>
+              </w:rPr>
+              <w:t xml:space="preserve">  nempel di undangan" — body "Logo layanan gratisan mejeng di pojok — momen sekali seumur</w:t>
+            </w:r>
+          </w:p>
+          <w:p>
+            <w:pPr>
+              <w:spacing w:after="40"/>
+            </w:pPr>
+            <w:r>
+              <w:rPr>
+                <w:rFonts w:ascii="Consolas" w:cs="Consolas" w:eastAsia="Consolas" w:hAnsi="Consolas"/>
+                <w:color w:val="2A2118"/>
+                <w:sz w:val="18"/>
+                <w:szCs w:val="18"/>
+              </w:rPr>
+              <w:t xml:space="preserve">  hidup, tapi kesannya numpang template murahan."</w:t>
+            </w:r>
+          </w:p>
+          <w:p>
+            <w:pPr>
+              <w:spacing w:after="40"/>
+            </w:pPr>
+            <w:r>
+              <w:rPr>
+                <w:rFonts w:ascii="Consolas" w:cs="Consolas" w:eastAsia="Consolas" w:hAnsi="Consolas"/>
+                <w:color w:val="2A2118"/>
+                <w:sz w:val="18"/>
+                <w:szCs w:val="18"/>
+              </w:rPr>
+              <w:t xml:space="preserve">- Slide 4 (RF 03): ikon speaker (garis, terracotta). Judul "Musik autoplay kenceng tanpa</w:t>
+            </w:r>
+          </w:p>
+          <w:p>
+            <w:pPr>
+              <w:spacing w:after="40"/>
+            </w:pPr>
+            <w:r>
+              <w:rPr>
+                <w:rFonts w:ascii="Consolas" w:cs="Consolas" w:eastAsia="Consolas" w:hAnsi="Consolas"/>
+                <w:color w:val="2A2118"/>
+                <w:sz w:val="18"/>
+                <w:szCs w:val="18"/>
+              </w:rPr>
+              <w:t xml:space="preserve">  izin" — body "Dibuka di kantor atau angkot, tiba-tiba bunyi — tamu panik nutup</w:t>
+            </w:r>
+          </w:p>
+          <w:p>
+            <w:pPr>
+              <w:spacing w:after="40"/>
+            </w:pPr>
+            <w:r>
+              <w:rPr>
+                <w:rFonts w:ascii="Consolas" w:cs="Consolas" w:eastAsia="Consolas" w:hAnsi="Consolas"/>
+                <w:color w:val="2A2118"/>
+                <w:sz w:val="18"/>
+                <w:szCs w:val="18"/>
+              </w:rPr>
+              <w:t xml:space="preserve">  undanganmu sebelum sempat baca."</w:t>
+            </w:r>
+          </w:p>
+          <w:p>
+            <w:pPr>
+              <w:spacing w:after="40"/>
+            </w:pPr>
+            <w:r>
+              <w:rPr>
+                <w:rFonts w:ascii="Consolas" w:cs="Consolas" w:eastAsia="Consolas" w:hAnsi="Consolas"/>
+                <w:color w:val="2A2118"/>
+                <w:sz w:val="18"/>
+                <w:szCs w:val="18"/>
+              </w:rPr>
+              <w:t xml:space="preserve">  (Judul Montserrat bold #2A2118, body Biryani #5C4A3A, nomor besar tipis peach di pojok</w:t>
+            </w:r>
+          </w:p>
+          <w:p>
+            <w:pPr>
+              <w:spacing w:after="40"/>
+            </w:pPr>
+            <w:r>
+              <w:rPr>
+                <w:rFonts w:ascii="Consolas" w:cs="Consolas" w:eastAsia="Consolas" w:hAnsi="Consolas"/>
+                <w:color w:val="2A2118"/>
+                <w:sz w:val="18"/>
+                <w:szCs w:val="18"/>
+              </w:rPr>
+              <w:t xml:space="preserve">  kanan bawah: 01/02/03. Eyebrow kiri atas "RED FLAG 01/02/03", counter kanan atas 2/6 dst.)</w:t>
+            </w:r>
+          </w:p>
+          <w:p>
+            <w:pPr>
+              <w:spacing w:after="40"/>
+            </w:pPr>
+            <w:r>
+              <w:rPr>
+                <w:rFonts w:ascii="Consolas" w:cs="Consolas" w:eastAsia="Consolas" w:hAnsi="Consolas"/>
+                <w:color w:val="2A2118"/>
+                <w:sz w:val="18"/>
+                <w:szCs w:val="18"/>
+              </w:rPr>
+              <w:t xml:space="preserve">- Slide 5 (refleksi): eyebrow "REFLEKSI", teks script terracotta kecil "tanya dirimu...",</w:t>
+            </w:r>
+          </w:p>
+          <w:p>
+            <w:pPr>
+              <w:spacing w:after="40"/>
+            </w:pPr>
+            <w:r>
+              <w:rPr>
+                <w:rFonts w:ascii="Consolas" w:cs="Consolas" w:eastAsia="Consolas" w:hAnsi="Consolas"/>
+                <w:color w:val="2A2118"/>
+                <w:sz w:val="18"/>
+                <w:szCs w:val="18"/>
+              </w:rPr>
+              <w:t xml:space="preserve">  lalu pertanyaan besar "Lima detik pertama tamu buka undanganmu — kesan apa yang mereka</w:t>
+            </w:r>
+          </w:p>
+          <w:p>
+            <w:pPr>
+              <w:spacing w:after="40"/>
+            </w:pPr>
+            <w:r>
+              <w:rPr>
+                <w:rFonts w:ascii="Consolas" w:cs="Consolas" w:eastAsia="Consolas" w:hAnsi="Consolas"/>
+                <w:color w:val="2A2118"/>
+                <w:sz w:val="18"/>
+                <w:szCs w:val="18"/>
+              </w:rPr>
+              <w:t xml:space="preserve">  dapat?"</w:t>
+            </w:r>
+          </w:p>
+          <w:p>
+            <w:pPr>
+              <w:spacing w:after="40"/>
+            </w:pPr>
+            <w:r>
+              <w:rPr>
+                <w:rFonts w:ascii="Consolas" w:cs="Consolas" w:eastAsia="Consolas" w:hAnsi="Consolas"/>
+                <w:color w:val="2A2118"/>
+                <w:sz w:val="18"/>
+                <w:szCs w:val="18"/>
+              </w:rPr>
+              <w:t xml:space="preserve">- Slide 6 (CTA): "FinCards dirancang buat ngindarin 3 hal ini." ("3 hal ini" terracotta) +</w:t>
+            </w:r>
+          </w:p>
+          <w:p>
+            <w:pPr>
+              <w:spacing w:after="40"/>
+            </w:pPr>
+            <w:r>
+              <w:rPr>
+                <w:rFonts w:ascii="Consolas" w:cs="Consolas" w:eastAsia="Consolas" w:hAnsi="Consolas"/>
+                <w:color w:val="2A2118"/>
+                <w:sz w:val="18"/>
+                <w:szCs w:val="18"/>
+              </w:rPr>
+              <w:t xml:space="preserve">  wordmark FinCards gede script + pill terracotta "Link di bio" + footer kanan tagline</w:t>
+            </w:r>
+          </w:p>
+          <w:p>
+            <w:pPr>
+              <w:spacing w:after="40"/>
+            </w:pPr>
+            <w:r>
+              <w:rPr>
+                <w:rFonts w:ascii="Consolas" w:cs="Consolas" w:eastAsia="Consolas" w:hAnsi="Consolas"/>
+                <w:color w:val="2A2118"/>
+                <w:sz w:val="18"/>
+                <w:szCs w:val="18"/>
+              </w:rPr>
+              <w:t xml:space="preserve">  "designed to be remembered" (kata "remembered" terracotta).</w:t>
+            </w:r>
+          </w:p>
+          <w:p>
+            <w:pPr>
+              <w:spacing w:after="40"/>
+            </w:pPr>
+            <w:r>
+              <w:rPr>
+                <w:rFonts w:ascii="Consolas" w:cs="Consolas" w:eastAsia="Consolas" w:hAnsi="Consolas"/>
+                <w:color w:val="2A2118"/>
+                <w:sz w:val="18"/>
+                <w:szCs w:val="18"/>
+              </w:rPr>
+              <w:t xml:space="preserve">JANGAN pakai red flag "detail harus di layar pertama" atau "animasi kebanyakan" (bumerang).</w:t>
             </w:r>
           </w:p>
           <w:p>
@@ -7081,7 +7281,7 @@
           <w:rFonts w:ascii="Calibri" w:cs="Calibri" w:eastAsia="Calibri" w:hAnsi="Calibri"/>
           <w:color w:val="2A2118"/>
         </w:rPr>
-        <w:t xml:space="preserve">7 slide — Slide 2: RSVP real-time. Slide 3: galeri foto &amp; video. Slide 4: peta lokasi terintegrasi. Slide 5: cepat diakses di HP. Slide 6: personalisasi — bukan cuma ganti nama di template orang lain. Slide 7 (CTA): “FinCards udah punya semua ini + experience yang beda. Link di bio.”</w:t>
+        <w:t xml:space="preserve">7 slide — Slide 2: RSVP real-time. Slide 3: galeri foto (dikurasi, unlimited). Slide 4: peta lokasi terintegrasi. Slide 5: cepat diakses di HP. Slide 6: personalisasi — bukan cuma ganti nama di template orang lain. Slide 7 (CTA): “FinCards udah punya semua ini + experience yang beda. Link di bio.”</w:t>
       </w:r>
     </w:p>
     <w:p>
@@ -7573,7 +7773,7 @@
           <w:sz w:val="20"/>
           <w:szCs w:val="20"/>
         </w:rPr>
-        <w:t xml:space="preserve">Fitur pamungkas kamu. Undangan FinCards ga berhenti di link — dia bantu kamu pas hari-H. Ini yang bikin beda dari “sekadar undangan cantik”.</w:t>
+        <w:t xml:space="preserve">Fitur pamungkas kamu. Undangan FinCards ga berhenti di link — dia bantu kamu pas hari-H. Ini yang bikin beda dari “sekadar undangan cantik”. AKURASI (dari DB): buku tamu + QR check-in itu fitur PREMIUM (Rp299rb), bukan Basic — frame post ini sebagai keunggulan Premium / alasan upgrade, jangan nyiratin semua paket dapat.</w:t>
       </w:r>
     </w:p>
     <w:p>
@@ -7911,7 +8111,7 @@
           <w:iCs/>
           <w:color w:val="5C4A3A"/>
         </w:rPr>
-        <w:t xml:space="preserve">“Buku tamu kertas suka bikin drama: antri di pintu, tulisan ga kebaca, datanya ilang entah ke mana. Undangan FinCards udah termasuk buku tamu digital + QR check-in — tamu tinggal scan pas dateng, kamu dapet daftar hadir &amp; ucapan yang rapi otomatis, kepantau dari dashboard. Undangan yang kerja sampai hari-H. Link di bio.”</w:t>
+        <w:t xml:space="preserve">“Buku tamu kertas suka bikin drama: antri di pintu, tulisan ga kebaca, datanya ilang entah ke mana. Paket Premium FinCards udah termasuk buku tamu digital + QR check-in — tamu tinggal scan pas dateng, kamu dapet daftar hadir &amp; ucapan yang rapi otomatis, kepantau dari dashboard. Undangan yang kerja sampai hari-H. Link di bio.”</w:t>
       </w:r>
     </w:p>
     <w:p>
@@ -8646,7 +8846,7 @@
           <w:rFonts w:ascii="Calibri" w:cs="Calibri" w:eastAsia="Calibri" w:hAnsi="Calibri"/>
           <w:color w:val="2A2118"/>
         </w:rPr>
-        <w:t xml:space="preserve">Versi B (AKTIF) — carousel “Ini yang kamu dapet kalau mulai di FinCards sekarang”, breakdown paket: Basic Rp149.000 (RSVP, buku tamu digital, galeri, aktif 1 tahun, s/d 200 tamu); Premium Rp299.000 (semua Basic + galeri unlimited, tanpa watermark, musik, palette switcher, s/d 300 tamu); tambah tamu +50 = Rp10.000.</w:t>
+        <w:t xml:space="preserve">Versi B (AKTIF) — carousel “Ini yang kamu dapet kalau mulai di FinCards sekarang”, breakdown paket (fitur dari DB template_plans): Basic Rp149.000 (Edit sendiri, RSVP, Amplop digital, Galeri unlimited, Backsound bebas, aktif 1 tahun, s/d 200 tamu); Premium Rp299.000 (semua Basic + seumur hidup, buku tamu + QR check-in, s/d 300 tamu); tambah tamu +50 = Rp10.000. AKURASI: buku tamu + QR = PREMIUM (bukan Basic); galeri Basic udah unlimited; jangan pakai 'tanpa watermark/musik/palette' sebagai pembeda Premium (watermark ga ada; musik &amp; palette udah di Basic).</w:t>
       </w:r>
     </w:p>
     <w:p>
@@ -8771,7 +8971,7 @@
                 <w:sz w:val="18"/>
                 <w:szCs w:val="18"/>
               </w:rPr>
-              <w:t xml:space="preserve">  bercentang terracotta: RSVP, Buku tamu digital, Galeri, aktif 1 tahun, s/d 200 tamu.</w:t>
+              <w:t xml:space="preserve">  bercentang terracotta: Edit sendiri, RSVP, Amplop digital, Galeri unlimited, Backsound, aktif 1 tahun, s/d 200 tamu.</w:t>
             </w:r>
           </w:p>
           <w:p>
@@ -8799,21 +8999,21 @@
                 <w:sz w:val="18"/>
                 <w:szCs w:val="18"/>
               </w:rPr>
-              <w:t xml:space="preserve">  'Paling Laris' gold #F5C842): semua Basic + Galeri unlimited, Tanpa watermark,</w:t>
-            </w:r>
-          </w:p>
-          <w:p>
-            <w:pPr>
-              <w:spacing w:after="40"/>
-            </w:pPr>
-            <w:r>
-              <w:rPr>
-                <w:rFonts w:ascii="Consolas" w:cs="Consolas" w:eastAsia="Consolas" w:hAnsi="Consolas"/>
-                <w:color w:val="2A2118"/>
-                <w:sz w:val="18"/>
-                <w:szCs w:val="18"/>
-              </w:rPr>
-              <w:t xml:space="preserve">  Musik, Palette switcher, s/d 300 tamu.</w:t>
+              <w:t xml:space="preserve">  'Paling Laris' gold #F5C842): semua Basic + masa aktif SEUMUR HIDUP,</w:t>
+            </w:r>
+          </w:p>
+          <w:p>
+            <w:pPr>
+              <w:spacing w:after="40"/>
+            </w:pPr>
+            <w:r>
+              <w:rPr>
+                <w:rFonts w:ascii="Consolas" w:cs="Consolas" w:eastAsia="Consolas" w:hAnsi="Consolas"/>
+                <w:color w:val="2A2118"/>
+                <w:sz w:val="18"/>
+                <w:szCs w:val="18"/>
+              </w:rPr>
+              <w:t xml:space="preserve">  Buku tamu + QR check-in, s/d 300 tamu.</w:t>
             </w:r>
           </w:p>
           <w:p>
@@ -8872,7 +9072,7 @@
           <w:iCs/>
           <w:color w:val="5C4A3A"/>
         </w:rPr>
-        <w:t xml:space="preserve">“Transparan dari awal — ga ada biaya kejutan. Mulai Rp149rb, undangan kamu udah lengkap sama RSVP &amp; buku tamu digital. Ada pertanyaan soal paket? DM aja.”</w:t>
+        <w:t xml:space="preserve">“Transparan dari awal — ga ada biaya kejutan. Mulai Rp149rb, undangan kamu udah lengkap sama edit-sendiri, RSVP &amp; galeri unlimited. Mau buku tamu + QR check-in? Itu di Premium. Ada pertanyaan soal paket? DM aja.”</w:t>
       </w:r>
     </w:p>
     <w:p>

</xml_diff>